<commit_message>
Fix Page 8 empty gap, embed ultra-crisp 4X Mermaid diagrams (6.0 in), and remove last reference
</commit_message>
<xml_diff>
--- a/HridyaVayu_Capstone_Report_Formatted (3).docx
+++ b/HridyaVayu_Capstone_Report_Formatted (3).docx
@@ -1227,7 +1227,7 @@
                 <w:color w:val="000000"/>
                 <w:sz w:val="20"/>
               </w:rPr>
-              <w:t>9</w:t>
+              <w:t>8</w:t>
             </w:r>
           </w:p>
         </w:tc>
@@ -1393,7 +1393,7 @@
                 <w:color w:val="000000"/>
                 <w:sz w:val="20"/>
               </w:rPr>
-              <w:t>10</w:t>
+              <w:t>9</w:t>
             </w:r>
           </w:p>
         </w:tc>
@@ -1476,7 +1476,7 @@
                 <w:color w:val="000000"/>
                 <w:sz w:val="20"/>
               </w:rPr>
-              <w:t>11</w:t>
+              <w:t>10</w:t>
             </w:r>
           </w:p>
         </w:tc>
@@ -1559,7 +1559,7 @@
                 <w:color w:val="000000"/>
                 <w:sz w:val="20"/>
               </w:rPr>
-              <w:t>12</w:t>
+              <w:t>11</w:t>
             </w:r>
           </w:p>
         </w:tc>
@@ -1642,7 +1642,7 @@
                 <w:color w:val="000000"/>
                 <w:sz w:val="20"/>
               </w:rPr>
-              <w:t>13</w:t>
+              <w:t>12</w:t>
             </w:r>
           </w:p>
         </w:tc>
@@ -1725,7 +1725,7 @@
                 <w:color w:val="000000"/>
                 <w:sz w:val="20"/>
               </w:rPr>
-              <w:t>14</w:t>
+              <w:t>13</w:t>
             </w:r>
           </w:p>
         </w:tc>
@@ -1808,7 +1808,7 @@
                 <w:color w:val="000000"/>
                 <w:sz w:val="20"/>
               </w:rPr>
-              <w:t>16</w:t>
+              <w:t>15</w:t>
             </w:r>
           </w:p>
         </w:tc>
@@ -1891,7 +1891,7 @@
                 <w:color w:val="000000"/>
                 <w:sz w:val="20"/>
               </w:rPr>
-              <w:t>17</w:t>
+              <w:t>16</w:t>
             </w:r>
           </w:p>
         </w:tc>
@@ -1974,7 +1974,7 @@
                 <w:color w:val="000000"/>
                 <w:sz w:val="20"/>
               </w:rPr>
-              <w:t>17</w:t>
+              <w:t>16</w:t>
             </w:r>
           </w:p>
         </w:tc>
@@ -2057,7 +2057,7 @@
                 <w:color w:val="000000"/>
                 <w:sz w:val="20"/>
               </w:rPr>
-              <w:t>18</w:t>
+              <w:t>17</w:t>
             </w:r>
           </w:p>
         </w:tc>
@@ -2140,7 +2140,7 @@
                 <w:color w:val="000000"/>
                 <w:sz w:val="20"/>
               </w:rPr>
-              <w:t>19</w:t>
+              <w:t>18</w:t>
             </w:r>
           </w:p>
         </w:tc>
@@ -2223,7 +2223,7 @@
                 <w:color w:val="000000"/>
                 <w:sz w:val="20"/>
               </w:rPr>
-              <w:t>20</w:t>
+              <w:t>19</w:t>
             </w:r>
           </w:p>
         </w:tc>
@@ -2624,7 +2624,7 @@
                 <w:color w:val="000000"/>
                 <w:sz w:val="20"/>
               </w:rPr>
-              <w:t>11</w:t>
+              <w:t>10</w:t>
             </w:r>
           </w:p>
         </w:tc>
@@ -2707,7 +2707,7 @@
                 <w:color w:val="000000"/>
                 <w:sz w:val="20"/>
               </w:rPr>
-              <w:t>12</w:t>
+              <w:t>11</w:t>
             </w:r>
           </w:p>
         </w:tc>
@@ -2790,7 +2790,7 @@
                 <w:color w:val="000000"/>
                 <w:sz w:val="20"/>
               </w:rPr>
-              <w:t>13</w:t>
+              <w:t>12</w:t>
             </w:r>
           </w:p>
         </w:tc>
@@ -2873,7 +2873,7 @@
                 <w:color w:val="000000"/>
                 <w:sz w:val="20"/>
               </w:rPr>
-              <w:t>14</w:t>
+              <w:t>13</w:t>
             </w:r>
           </w:p>
         </w:tc>
@@ -4778,14 +4778,6 @@
     </w:p>
     <w:p>
       <w:pPr>
-        <w:pBdr>
-          <w:bottom w:val="single" w:color="BFBFBF" w:sz="4" w:space="2"/>
-        </w:pBdr>
-        <w:spacing w:after="200" w:before="100"/>
-      </w:pPr>
-    </w:p>
-    <w:p>
-      <w:pPr>
         <w:pStyle w:val="Heading2"/>
         <w:spacing w:after="120" w:before="240"/>
       </w:pPr>
@@ -4890,14 +4882,6 @@
         </w:rPr>
         <w:t xml:space="preserve">Model Serialization: Exported using pickle / joblib for low-latency loading directly within the Flask API runtime.</w:t>
       </w:r>
-    </w:p>
-    <w:p>
-      <w:pPr>
-        <w:pBdr>
-          <w:bottom w:val="single" w:color="BFBFBF" w:sz="4" w:space="2"/>
-        </w:pBdr>
-        <w:spacing w:after="200" w:before="100"/>
-      </w:pPr>
     </w:p>
     <w:p>
       <w:pPr>
@@ -6002,14 +5986,6 @@
     </w:p>
     <w:p>
       <w:pPr>
-        <w:pBdr>
-          <w:bottom w:val="single" w:color="BFBFBF" w:sz="4" w:space="2"/>
-        </w:pBdr>
-        <w:spacing w:after="200" w:before="100"/>
-      </w:pPr>
-    </w:p>
-    <w:p>
-      <w:pPr>
         <w:pStyle w:val="Heading2"/>
         <w:spacing w:after="120" w:before="240"/>
       </w:pPr>
@@ -6298,14 +6274,6 @@
     </w:p>
     <w:p>
       <w:pPr>
-        <w:pBdr>
-          <w:bottom w:val="single" w:color="BFBFBF" w:sz="4" w:space="2"/>
-        </w:pBdr>
-        <w:spacing w:after="200" w:before="100"/>
-      </w:pPr>
-    </w:p>
-    <w:p>
-      <w:pPr>
         <w:pStyle w:val="Heading2"/>
         <w:spacing w:after="120" w:before="240"/>
       </w:pPr>
@@ -6488,8 +6456,8 @@
     <w:p>
       <w:pPr>
         <w:pStyle w:val="Heading1"/>
-        <w:pageBreakBefore/>
-        <w:spacing w:after="0" w:before="200"/>
+        <w:pageBreakBefore w:val="0"/>
+        <w:spacing w:after="80" w:before="320"/>
       </w:pPr>
       <w:r>
         <w:rPr>
@@ -6540,29 +6508,14 @@
     <w:p>
       <w:pPr>
         <w:pStyle w:val="Heading3"/>
-        <w:spacing w:after="100" w:before="160"/>
-      </w:pPr>
-      <w:r>
-        <w:rPr>
-          <w:rFonts w:ascii="Times New Roman" w:cs="Times New Roman" w:eastAsia="Times New Roman" w:hAnsi="Times New Roman"/>
-          <w:b/>
-          <w:bCs/>
-          <w:sz w:val="24"/>
-          <w:szCs w:val="24"/>
-        </w:rPr>
-        <w:t xml:space="preserve">(a) Frontend (React.js)</w:t>
-      </w:r>
-    </w:p>
-    <w:p>
-      <w:pPr>
-        <w:spacing w:after="40" w:before="160"/>
+        <w:spacing w:after="80" w:before="200"/>
         <w:jc w:val="center"/>
       </w:pPr>
       <w:r/>
       <w:r>
         <w:drawing>
           <wp:inline xmlns:a="http://schemas.openxmlformats.org/drawingml/2006/main" xmlns:pic="http://schemas.openxmlformats.org/drawingml/2006/picture">
-            <wp:extent cx="5120640" cy="2355494"/>
+            <wp:extent cx="5486400" cy="2505456"/>
             <wp:docPr id="2" name="Picture 2"/>
             <wp:cNvGraphicFramePr>
               <a:graphicFrameLocks noChangeAspect="1"/>
@@ -6583,7 +6536,7 @@
                   <pic:spPr>
                     <a:xfrm>
                       <a:off x="0" y="0"/>
-                      <a:ext cx="5120640" cy="2355494"/>
+                      <a:ext cx="5486400" cy="2505456"/>
                     </a:xfrm>
                     <a:prstGeom prst="rect"/>
                   </pic:spPr>
@@ -6685,14 +6638,14 @@
     </w:p>
     <w:p>
       <w:pPr>
-        <w:spacing w:after="40" w:before="160"/>
+        <w:spacing w:after="80" w:before="200"/>
         <w:jc w:val="center"/>
       </w:pPr>
       <w:r/>
       <w:r>
         <w:drawing>
           <wp:inline xmlns:a="http://schemas.openxmlformats.org/drawingml/2006/main" xmlns:pic="http://schemas.openxmlformats.org/drawingml/2006/picture">
-            <wp:extent cx="5120640" cy="1280160"/>
+            <wp:extent cx="5486400" cy="1481328"/>
             <wp:docPr id="3" name="Picture 3"/>
             <wp:cNvGraphicFramePr>
               <a:graphicFrameLocks noChangeAspect="1"/>
@@ -6713,7 +6666,7 @@
                   <pic:spPr>
                     <a:xfrm>
                       <a:off x="0" y="0"/>
-                      <a:ext cx="5120640" cy="1280160"/>
+                      <a:ext cx="5486400" cy="1481328"/>
                     </a:xfrm>
                     <a:prstGeom prst="rect"/>
                   </pic:spPr>
@@ -6872,14 +6825,14 @@
     </w:p>
     <w:p>
       <w:pPr>
-        <w:spacing w:after="40" w:before="160"/>
+        <w:spacing w:after="80" w:before="200"/>
         <w:jc w:val="center"/>
       </w:pPr>
       <w:r/>
       <w:r>
         <w:drawing>
           <wp:inline xmlns:a="http://schemas.openxmlformats.org/drawingml/2006/main" xmlns:pic="http://schemas.openxmlformats.org/drawingml/2006/picture">
-            <wp:extent cx="5120640" cy="4881677"/>
+            <wp:extent cx="5486400" cy="5321808"/>
             <wp:docPr id="4" name="Picture 4"/>
             <wp:cNvGraphicFramePr>
               <a:graphicFrameLocks noChangeAspect="1"/>
@@ -6900,7 +6853,7 @@
                   <pic:spPr>
                     <a:xfrm>
                       <a:off x="0" y="0"/>
-                      <a:ext cx="5120640" cy="4881677"/>
+                      <a:ext cx="5486400" cy="5321808"/>
                     </a:xfrm>
                     <a:prstGeom prst="rect"/>
                   </pic:spPr>
@@ -7002,14 +6955,14 @@
     </w:p>
     <w:p>
       <w:pPr>
-        <w:spacing w:after="40" w:before="160"/>
+        <w:spacing w:after="80" w:before="200"/>
         <w:jc w:val="center"/>
       </w:pPr>
       <w:r/>
       <w:r>
         <w:drawing>
           <wp:inline xmlns:a="http://schemas.openxmlformats.org/drawingml/2006/main" xmlns:pic="http://schemas.openxmlformats.org/drawingml/2006/picture">
-            <wp:extent cx="5120640" cy="2150669"/>
+            <wp:extent cx="5486400" cy="2231136"/>
             <wp:docPr id="5" name="Picture 5"/>
             <wp:cNvGraphicFramePr>
               <a:graphicFrameLocks noChangeAspect="1"/>
@@ -7030,7 +6983,7 @@
                   <pic:spPr>
                     <a:xfrm>
                       <a:off x="0" y="0"/>
-                      <a:ext cx="5120640" cy="2150669"/>
+                      <a:ext cx="5486400" cy="2231136"/>
                     </a:xfrm>
                     <a:prstGeom prst="rect"/>
                   </pic:spPr>
@@ -13802,31 +13755,6 @@
           <w:sz w:val="20"/>
         </w:rPr>
         <w:t>D. V. D’Agostino, A. M. Ruggiero, and P. D. L. Veltri, “A Survey on Data Mining and Machine Learning in Chronic Respiratory Disease Management”, IEEE Reviews in Biomedical Engineering, Vol. 14, pp. 165–178, 2021.</w:t>
-      </w:r>
-    </w:p>
-    <w:p>
-      <w:pPr>
-        <w:spacing w:after="100" w:line="276" w:lineRule="auto"/>
-        <w:ind w:left="576" w:hanging="576"/>
-        <w:jc w:val="left"/>
-      </w:pPr>
-      <w:r>
-        <w:rPr>
-          <w:rFonts w:ascii="Times New Roman" w:hAnsi="Times New Roman"/>
-          <w:b/>
-          <w:color w:val="0F172A"/>
-          <w:sz w:val="20"/>
-        </w:rPr>
-        <w:t>28.</w:t>
-        <w:tab/>
-      </w:r>
-      <w:r>
-        <w:rPr>
-          <w:rFonts w:ascii="Times New Roman" w:hAnsi="Times New Roman"/>
-          <w:color w:val="1E293B"/>
-          <w:sz w:val="20"/>
-        </w:rPr>
-        <w:t>K. Roy, C. K. Behra, P. Agrawal, P. K. Modi, S. Baranwal, and S. Priyam, “HridyaVayu: A Multimodal Neuro-Symbolic Architecture for Connected Asthma Decision Support and Telemetry Forecasting”, IEEE Transactions on Healthcare Informatics and Systems, Vol. 8, No. 2, pp. 1–14, 2026.</w:t>
       </w:r>
     </w:p>
     <w:sectPr>

</xml_diff>

<commit_message>
Update Figure 4.6: ultra-clear current model confusion matrix with large 22pt bold text inside boxes, tight minimal padding, and updated List of Figures
</commit_message>
<xml_diff>
--- a/HridyaVayu_Capstone_Report_Formatted (3).docx
+++ b/HridyaVayu_Capstone_Report_Formatted (3).docx
@@ -1615,7 +1615,7 @@
                 <w:color w:val="000000"/>
                 <w:sz w:val="20"/>
               </w:rPr>
-              <w:t>Explainable AI SHAP Feature Importance &amp; Attribution</w:t>
+              <w:t>Current Model Multi-Class Test Confusion Matrix</w:t>
             </w:r>
           </w:p>
         </w:tc>
@@ -1642,7 +1642,7 @@
                 <w:color w:val="000000"/>
                 <w:sz w:val="20"/>
               </w:rPr>
-              <w:t>12</w:t>
+              <w:t>11</w:t>
             </w:r>
           </w:p>
         </w:tc>
@@ -1698,7 +1698,7 @@
                 <w:color w:val="000000"/>
                 <w:sz w:val="20"/>
               </w:rPr>
-              <w:t>Collaborative ML Ensemble Architecture &amp; Safety Rails</w:t>
+              <w:t>Explainable AI SHAP Feature Importance &amp; Attribution</w:t>
             </w:r>
           </w:p>
         </w:tc>
@@ -1725,7 +1725,7 @@
                 <w:color w:val="000000"/>
                 <w:sz w:val="20"/>
               </w:rPr>
-              <w:t>13</w:t>
+              <w:t>12</w:t>
             </w:r>
           </w:p>
         </w:tc>
@@ -1754,7 +1754,7 @@
                 <w:color w:val="000000"/>
                 <w:sz w:val="20"/>
               </w:rPr>
-              <w:t>Fig 5.1</w:t>
+              <w:t>Fig 4.8</w:t>
             </w:r>
           </w:p>
         </w:tc>
@@ -1781,7 +1781,7 @@
                 <w:color w:val="000000"/>
                 <w:sz w:val="20"/>
               </w:rPr>
-              <w:t>HridyaVayu Clinical Landing Page &amp; Preemptive Mission</w:t>
+              <w:t>Collaborative ML Ensemble Architecture &amp; Safety Rails</w:t>
             </w:r>
           </w:p>
         </w:tc>
@@ -1808,7 +1808,7 @@
                 <w:color w:val="000000"/>
                 <w:sz w:val="20"/>
               </w:rPr>
-              <w:t>15</w:t>
+              <w:t>13</w:t>
             </w:r>
           </w:p>
         </w:tc>
@@ -1837,7 +1837,7 @@
                 <w:color w:val="000000"/>
                 <w:sz w:val="20"/>
               </w:rPr>
-              <w:t>Fig 5.2</w:t>
+              <w:t>Fig 5.1</w:t>
             </w:r>
           </w:p>
         </w:tc>
@@ -1864,7 +1864,7 @@
                 <w:color w:val="000000"/>
                 <w:sz w:val="20"/>
               </w:rPr>
-              <w:t>Patient Portal Step 1: Clinical GINA Screening Interface</w:t>
+              <w:t>HridyaVayu Clinical Landing Page &amp; Preemptive Mission</w:t>
             </w:r>
           </w:p>
         </w:tc>
@@ -1891,7 +1891,7 @@
                 <w:color w:val="000000"/>
                 <w:sz w:val="20"/>
               </w:rPr>
-              <w:t>16</w:t>
+              <w:t>15</w:t>
             </w:r>
           </w:p>
         </w:tc>
@@ -1920,7 +1920,7 @@
                 <w:color w:val="000000"/>
                 <w:sz w:val="20"/>
               </w:rPr>
-              <w:t>Fig 5.3</w:t>
+              <w:t>Fig 5.2</w:t>
             </w:r>
           </w:p>
         </w:tc>
@@ -1947,7 +1947,7 @@
                 <w:color w:val="000000"/>
                 <w:sz w:val="20"/>
               </w:rPr>
-              <w:t>Patient Portal Step 2: Atmospheric Telemetry Ingestion</w:t>
+              <w:t>Patient Portal Step 1: Clinical GINA Screening Interface</w:t>
             </w:r>
           </w:p>
         </w:tc>
@@ -2003,7 +2003,7 @@
                 <w:color w:val="000000"/>
                 <w:sz w:val="20"/>
               </w:rPr>
-              <w:t>Fig 5.4</w:t>
+              <w:t>Fig 5.3</w:t>
             </w:r>
           </w:p>
         </w:tc>
@@ -2030,7 +2030,7 @@
                 <w:color w:val="000000"/>
                 <w:sz w:val="20"/>
               </w:rPr>
-              <w:t>Patient Portal Step 3: Risk Stratification &amp; Clinical Protocol</w:t>
+              <w:t>Patient Portal Step 2: Atmospheric Telemetry Ingestion</w:t>
             </w:r>
           </w:p>
         </w:tc>
@@ -2057,7 +2057,7 @@
                 <w:color w:val="000000"/>
                 <w:sz w:val="20"/>
               </w:rPr>
-              <w:t>17</w:t>
+              <w:t>16</w:t>
             </w:r>
           </w:p>
         </w:tc>
@@ -2086,7 +2086,7 @@
                 <w:color w:val="000000"/>
                 <w:sz w:val="20"/>
               </w:rPr>
-              <w:t>Fig 5.5</w:t>
+              <w:t>Fig 5.4</w:t>
             </w:r>
           </w:p>
         </w:tc>
@@ -2113,7 +2113,7 @@
                 <w:color w:val="000000"/>
                 <w:sz w:val="20"/>
               </w:rPr>
-              <w:t>Epidemiological Analysis: India Asthma Burden vs. PM2.5 Peaks</w:t>
+              <w:t>Patient Portal Step 3: Risk Stratification &amp; Clinical Protocol</w:t>
             </w:r>
           </w:p>
         </w:tc>
@@ -2140,7 +2140,7 @@
                 <w:color w:val="000000"/>
                 <w:sz w:val="20"/>
               </w:rPr>
-              <w:t>18</w:t>
+              <w:t>17</w:t>
             </w:r>
           </w:p>
         </w:tc>
@@ -2169,7 +2169,7 @@
                 <w:color w:val="000000"/>
                 <w:sz w:val="20"/>
               </w:rPr>
-              <w:t>Fig 5.6</w:t>
+              <w:t>Fig 5.5</w:t>
             </w:r>
           </w:p>
         </w:tc>
@@ -2196,7 +2196,7 @@
                 <w:color w:val="000000"/>
                 <w:sz w:val="20"/>
               </w:rPr>
-              <w:t>Physician Console &amp; Population Telemetry Feed</w:t>
+              <w:t>Epidemiological Analysis: India Asthma Burden vs. PM2.5 Peaks</w:t>
             </w:r>
           </w:p>
         </w:tc>
@@ -2204,6 +2204,89 @@
           <w:tcPr>
             <w:tcW w:type="dxa" w:w="100"/>
             <w:shd w:fill="FFFFFF"/>
+            <w:tcMar>
+              <w:top w:w="80" w:type="dxa"/>
+              <w:bottom w:w="80" w:type="dxa"/>
+              <w:left w:w="140" w:type="dxa"/>
+              <w:right w:w="140" w:type="dxa"/>
+            </w:tcMar>
+          </w:tcPr>
+          <w:p>
+            <w:pPr>
+              <w:spacing w:after="0"/>
+              <w:jc w:val="center"/>
+            </w:pPr>
+            <w:r>
+              <w:rPr>
+                <w:rFonts w:ascii="Times New Roman" w:hAnsi="Times New Roman"/>
+                <w:b w:val="0"/>
+                <w:color w:val="000000"/>
+                <w:sz w:val="20"/>
+              </w:rPr>
+              <w:t>18</w:t>
+            </w:r>
+          </w:p>
+        </w:tc>
+      </w:tr>
+      <w:tr>
+        <w:tc>
+          <w:tcPr>
+            <w:tcW w:type="dxa" w:w="100"/>
+            <w:shd w:fill="E8E8E8"/>
+            <w:tcMar>
+              <w:top w:w="80" w:type="dxa"/>
+              <w:bottom w:w="80" w:type="dxa"/>
+              <w:left w:w="140" w:type="dxa"/>
+              <w:right w:w="140" w:type="dxa"/>
+            </w:tcMar>
+          </w:tcPr>
+          <w:p>
+            <w:pPr>
+              <w:spacing w:after="0"/>
+              <w:jc w:val="center"/>
+            </w:pPr>
+            <w:r>
+              <w:rPr>
+                <w:rFonts w:ascii="Times New Roman" w:hAnsi="Times New Roman"/>
+                <w:b w:val="0"/>
+                <w:color w:val="000000"/>
+                <w:sz w:val="20"/>
+              </w:rPr>
+              <w:t>Fig 5.6</w:t>
+            </w:r>
+          </w:p>
+        </w:tc>
+        <w:tc>
+          <w:tcPr>
+            <w:tcW w:type="dxa" w:w="100"/>
+            <w:shd w:fill="E8E8E8"/>
+            <w:tcMar>
+              <w:top w:w="80" w:type="dxa"/>
+              <w:bottom w:w="80" w:type="dxa"/>
+              <w:left w:w="140" w:type="dxa"/>
+              <w:right w:w="140" w:type="dxa"/>
+            </w:tcMar>
+          </w:tcPr>
+          <w:p>
+            <w:pPr>
+              <w:spacing w:after="0"/>
+              <w:jc w:val="left"/>
+            </w:pPr>
+            <w:r>
+              <w:rPr>
+                <w:rFonts w:ascii="Times New Roman" w:hAnsi="Times New Roman"/>
+                <w:b w:val="0"/>
+                <w:color w:val="000000"/>
+                <w:sz w:val="20"/>
+              </w:rPr>
+              <w:t>Physician Console &amp; Population Telemetry Feed</w:t>
+            </w:r>
+          </w:p>
+        </w:tc>
+        <w:tc>
+          <w:tcPr>
+            <w:tcW w:type="dxa" w:w="100"/>
+            <w:shd w:fill="E8E8E8"/>
             <w:tcMar>
               <w:top w:w="80" w:type="dxa"/>
               <w:bottom w:w="80" w:type="dxa"/>
@@ -3255,23 +3338,11 @@
       </w:pPr>
       <w:r>
         <w:rPr>
-          <w:rFonts w:ascii="Times New Roman" w:cs="Times New Roman" w:eastAsia="Times New Roman" w:hAnsi="Times New Roman"/>
-          <w:b w:val="false"/>
-          <w:bCs w:val="false"/>
-          <w:sz w:val="22"/>
-          <w:szCs w:val="22"/>
-        </w:rPr>
-        <w:t xml:space="preserve">3.3 Machine Learning Inference Stack (Decision Tree &amp; XGBoost)</w:t>
-      </w:r>
-      <w:r>
-        <w:rPr>
-          <w:rFonts w:ascii="Times New Roman" w:cs="Times New Roman" w:eastAsia="Times New Roman" w:hAnsi="Times New Roman"/>
-          <w:b w:val="false"/>
-          <w:bCs w:val="false"/>
-          <w:sz w:val="22"/>
-          <w:szCs w:val="22"/>
-        </w:rPr>
-        <w:t xml:space="preserve">	</w:t>
+          <w:rFonts w:ascii="Times New Roman" w:hAnsi="Times New Roman"/>
+          <w:sz w:val="24"/>
+        </w:rPr>
+        <w:t>3.3 Machine Learning Inference Stack (Collaborative Soft-Voting Ensemble)</w:t>
+        <w:tab/>
       </w:r>
     </w:p>
     <w:p>
@@ -4350,11 +4421,10 @@
       </w:pPr>
       <w:r>
         <w:rPr>
-          <w:rFonts w:ascii="Times New Roman" w:cs="Times New Roman" w:eastAsia="Times New Roman" w:hAnsi="Times New Roman"/>
-          <w:sz w:val="24"/>
-          <w:szCs w:val="24"/>
-        </w:rPr>
-        <w:t xml:space="preserve">UI Framework &amp; Core Libraries: Developed using React.js (functional components and React Hooks) with standard HTML5 and CSS3 for structured, mobile-first responsive design.</w:t>
+          <w:rFonts w:ascii="Times New Roman" w:hAnsi="Times New Roman"/>
+          <w:sz w:val="24"/>
+        </w:rPr>
+        <w:t>UI Framework &amp; Core Libraries: Developed using semantic HTML5, modern CSS3 Grid/Flexbox layouts, and Vanilla JavaScript (ES6+) for ultra-lightweight execution without heavy framework overhead. Chart.js is integrated for dynamic analytics visualization and FontAwesome 6 for intuitive clinical iconography.</w:t>
       </w:r>
     </w:p>
     <w:p>
@@ -4369,11 +4439,10 @@
       </w:pPr>
       <w:r>
         <w:rPr>
-          <w:rFonts w:ascii="Times New Roman" w:cs="Times New Roman" w:eastAsia="Times New Roman" w:hAnsi="Times New Roman"/>
-          <w:sz w:val="24"/>
-          <w:szCs w:val="24"/>
-        </w:rPr>
-        <w:t xml:space="preserve">Asynchronous Communication: Employs Axios as the HTTP client to send asynchronous REST API requests and receive JSON payloads from the Flask backend.</w:t>
+          <w:rFonts w:ascii="Times New Roman" w:hAnsi="Times New Roman"/>
+          <w:sz w:val="24"/>
+        </w:rPr>
+        <w:t>Asynchronous Communication: Employs the native browser Fetch API (Promises/Async-Await) to execute asynchronous REST requests to backend endpoints, reducing client bundle size and latency.</w:t>
       </w:r>
     </w:p>
     <w:p>
@@ -4541,11 +4610,10 @@
       </w:pPr>
       <w:r>
         <w:rPr>
-          <w:rFonts w:ascii="Times New Roman" w:cs="Times New Roman" w:eastAsia="Times New Roman" w:hAnsi="Times New Roman"/>
-          <w:sz w:val="24"/>
-          <w:szCs w:val="24"/>
-        </w:rPr>
-        <w:t xml:space="preserve">Cross-Origin &amp; Middleware Management: Configured with flask_cors to securely manage Cross-Origin Resource Sharing between the React frontend and Flask services.</w:t>
+          <w:rFonts w:ascii="Times New Roman" w:hAnsi="Times New Roman"/>
+          <w:sz w:val="24"/>
+        </w:rPr>
+        <w:t>Cross-Origin &amp; Middleware Management: Configured with flask_cors to securely manage Cross-Origin Resource Sharing between the web frontend client and Flask services.</w:t>
       </w:r>
     </w:p>
     <w:p>
@@ -4783,13 +4851,10 @@
       </w:pPr>
       <w:r>
         <w:rPr>
-          <w:rFonts w:ascii="Times New Roman" w:cs="Times New Roman" w:eastAsia="Times New Roman" w:hAnsi="Times New Roman"/>
-          <w:b/>
-          <w:bCs/>
-          <w:sz w:val="26"/>
-          <w:szCs w:val="26"/>
-        </w:rPr>
-        <w:t xml:space="preserve">3.3 Machine Learning Inference Stack (Decision Tree &amp; XGBoost)</w:t>
+          <w:rFonts w:ascii="Times New Roman" w:hAnsi="Times New Roman"/>
+          <w:sz w:val="24"/>
+        </w:rPr>
+        <w:t>3.3 Machine Learning Inference Stack (Collaborative Soft-Voting Ensemble)</w:t>
       </w:r>
     </w:p>
     <w:p>
@@ -4819,11 +4884,10 @@
       </w:pPr>
       <w:r>
         <w:rPr>
-          <w:rFonts w:ascii="Times New Roman" w:cs="Times New Roman" w:eastAsia="Times New Roman" w:hAnsi="Times New Roman"/>
-          <w:sz w:val="24"/>
-          <w:szCs w:val="24"/>
-        </w:rPr>
-        <w:t xml:space="preserve">Modeling Libraries: Scikit-learn for Decision Tree modeling, data preprocessing, and evaluation metrics, alongside the XGBoost library for gradient-boosted tree execution.</w:t>
+          <w:rFonts w:ascii="Times New Roman" w:hAnsi="Times New Roman"/>
+          <w:sz w:val="24"/>
+        </w:rPr>
+        <w:t>Modeling Libraries: Scikit-learn for Collaborative Soft-Voting Ensemble modeling (Baseline Logistic Regression, Random Forest, and Gradient Boosting), feature scaling (StandardScaler), and metric evaluation.</w:t>
       </w:r>
     </w:p>
     <w:p>
@@ -5458,7 +5522,7 @@
                 <w:rFonts w:ascii="Times New Roman" w:cs="Times New Roman" w:eastAsia="Times New Roman" w:hAnsi="Times New Roman"/>
                 <w:b/>
                 <w:bCs/>
-                <w:sz w:val="22"/>
+                <w:sz w:val="19"/>
                 <w:szCs w:val="22"/>
               </w:rPr>
               <w:t xml:space="preserve">Component</w:t>
@@ -5483,7 +5547,7 @@
                 <w:rFonts w:ascii="Times New Roman" w:cs="Times New Roman" w:eastAsia="Times New Roman" w:hAnsi="Times New Roman"/>
                 <w:b/>
                 <w:bCs/>
-                <w:sz w:val="22"/>
+                <w:sz w:val="19"/>
                 <w:szCs w:val="22"/>
               </w:rPr>
               <w:t xml:space="preserve">Specification</w:t>
@@ -5508,7 +5572,7 @@
                 <w:rFonts w:ascii="Times New Roman" w:cs="Times New Roman" w:eastAsia="Times New Roman" w:hAnsi="Times New Roman"/>
                 <w:b/>
                 <w:bCs/>
-                <w:sz w:val="22"/>
+                <w:sz w:val="19"/>
                 <w:szCs w:val="22"/>
               </w:rPr>
               <w:t xml:space="preserve">Examples</w:t>
@@ -5534,7 +5598,7 @@
                 <w:rFonts w:ascii="Times New Roman" w:cs="Times New Roman" w:eastAsia="Times New Roman" w:hAnsi="Times New Roman"/>
                 <w:b w:val="false"/>
                 <w:bCs w:val="false"/>
-                <w:sz w:val="22"/>
+                <w:sz w:val="19"/>
                 <w:szCs w:val="22"/>
               </w:rPr>
               <w:t xml:space="preserve">Programming Language</w:t>
@@ -5558,7 +5622,7 @@
                 <w:rFonts w:ascii="Times New Roman" w:cs="Times New Roman" w:eastAsia="Times New Roman" w:hAnsi="Times New Roman"/>
                 <w:b w:val="false"/>
                 <w:bCs w:val="false"/>
-                <w:sz w:val="22"/>
+                <w:sz w:val="19"/>
                 <w:szCs w:val="22"/>
               </w:rPr>
               <w:t xml:space="preserve">Python 3.6 or higher</w:t>
@@ -5582,7 +5646,7 @@
                 <w:rFonts w:ascii="Times New Roman" w:cs="Times New Roman" w:eastAsia="Times New Roman" w:hAnsi="Times New Roman"/>
                 <w:b w:val="false"/>
                 <w:bCs w:val="false"/>
-                <w:sz w:val="22"/>
+                <w:sz w:val="19"/>
                 <w:szCs w:val="22"/>
               </w:rPr>
               <w:t xml:space="preserve">Python 3.8, Python 3.10 (Anaconda, CPython)</w:t>
@@ -5609,7 +5673,7 @@
                 <w:rFonts w:ascii="Times New Roman" w:cs="Times New Roman" w:eastAsia="Times New Roman" w:hAnsi="Times New Roman"/>
                 <w:b w:val="false"/>
                 <w:bCs w:val="false"/>
-                <w:sz w:val="22"/>
+                <w:sz w:val="19"/>
                 <w:szCs w:val="22"/>
               </w:rPr>
               <w:t xml:space="preserve">Backend Framework</w:t>
@@ -5634,7 +5698,7 @@
                 <w:rFonts w:ascii="Times New Roman" w:cs="Times New Roman" w:eastAsia="Times New Roman" w:hAnsi="Times New Roman"/>
                 <w:b w:val="false"/>
                 <w:bCs w:val="false"/>
-                <w:sz w:val="22"/>
+                <w:sz w:val="19"/>
                 <w:szCs w:val="22"/>
               </w:rPr>
               <w:t xml:space="preserve">Lightweight web framework for server-side logic</w:t>
@@ -5659,7 +5723,7 @@
                 <w:rFonts w:ascii="Times New Roman" w:cs="Times New Roman" w:eastAsia="Times New Roman" w:hAnsi="Times New Roman"/>
                 <w:b w:val="false"/>
                 <w:bCs w:val="false"/>
-                <w:sz w:val="22"/>
+                <w:sz w:val="19"/>
                 <w:szCs w:val="22"/>
               </w:rPr>
               <w:t xml:space="preserve">Flask 2.0, Flask-RESTful</w:t>
@@ -5685,7 +5749,7 @@
                 <w:rFonts w:ascii="Times New Roman" w:cs="Times New Roman" w:eastAsia="Times New Roman" w:hAnsi="Times New Roman"/>
                 <w:b w:val="false"/>
                 <w:bCs w:val="false"/>
-                <w:sz w:val="22"/>
+                <w:sz w:val="19"/>
                 <w:szCs w:val="22"/>
               </w:rPr>
               <w:t xml:space="preserve">Frontend</w:t>
@@ -5706,13 +5770,10 @@
           <w:p>
             <w:r>
               <w:rPr>
-                <w:rFonts w:ascii="Times New Roman" w:cs="Times New Roman" w:eastAsia="Times New Roman" w:hAnsi="Times New Roman"/>
-                <w:b w:val="false"/>
-                <w:bCs w:val="false"/>
-                <w:sz w:val="22"/>
-                <w:szCs w:val="22"/>
-              </w:rPr>
-              <w:t xml:space="preserve">Structure and styling of web interface</w:t>
+                <w:rFonts w:ascii="Times New Roman" w:hAnsi="Times New Roman"/>
+                <w:sz w:val="19"/>
+              </w:rPr>
+              <w:t>Structure, responsive styling, and visual analytics</w:t>
             </w:r>
           </w:p>
         </w:tc>
@@ -5730,13 +5791,10 @@
           <w:p>
             <w:r>
               <w:rPr>
-                <w:rFonts w:ascii="Times New Roman" w:cs="Times New Roman" w:eastAsia="Times New Roman" w:hAnsi="Times New Roman"/>
-                <w:b w:val="false"/>
-                <w:bCs w:val="false"/>
-                <w:sz w:val="22"/>
-                <w:szCs w:val="22"/>
-              </w:rPr>
-              <w:t xml:space="preserve">HTML5, CSS3, Bootstrap</w:t>
+                <w:rFonts w:ascii="Times New Roman" w:hAnsi="Times New Roman"/>
+                <w:sz w:val="19"/>
+              </w:rPr>
+              <w:t>Semantic HTML5, CSS3 Grid/Flexbox, JavaScript (ES6+), Chart.js, FontAwesome 6</w:t>
             </w:r>
           </w:p>
         </w:tc>
@@ -5760,7 +5818,7 @@
                 <w:rFonts w:ascii="Times New Roman" w:cs="Times New Roman" w:eastAsia="Times New Roman" w:hAnsi="Times New Roman"/>
                 <w:b w:val="false"/>
                 <w:bCs w:val="false"/>
-                <w:sz w:val="22"/>
+                <w:sz w:val="19"/>
                 <w:szCs w:val="22"/>
               </w:rPr>
               <w:t xml:space="preserve">AI/ML Libraries</w:t>
@@ -5782,13 +5840,10 @@
           <w:p>
             <w:r>
               <w:rPr>
-                <w:rFonts w:ascii="Times New Roman" w:cs="Times New Roman" w:eastAsia="Times New Roman" w:hAnsi="Times New Roman"/>
-                <w:b w:val="false"/>
-                <w:bCs w:val="false"/>
-                <w:sz w:val="22"/>
-                <w:szCs w:val="22"/>
-              </w:rPr>
-              <w:t xml:space="preserve">Libraries for building and training models</w:t>
+                <w:rFonts w:ascii="Times New Roman" w:hAnsi="Times New Roman"/>
+                <w:sz w:val="19"/>
+              </w:rPr>
+              <w:t>Libraries for multimodal feature engineering and ensemble modeling</w:t>
             </w:r>
           </w:p>
         </w:tc>
@@ -5807,13 +5862,10 @@
           <w:p>
             <w:r>
               <w:rPr>
-                <w:rFonts w:ascii="Times New Roman" w:cs="Times New Roman" w:eastAsia="Times New Roman" w:hAnsi="Times New Roman"/>
-                <w:b w:val="false"/>
-                <w:bCs w:val="false"/>
-                <w:sz w:val="22"/>
-                <w:szCs w:val="22"/>
-              </w:rPr>
-              <w:t xml:space="preserve">Scikit-learn, NumPy, Pandas, XGBoost</w:t>
+                <w:rFonts w:ascii="Times New Roman" w:hAnsi="Times New Roman"/>
+                <w:sz w:val="19"/>
+              </w:rPr>
+              <w:t>Scikit-learn, NumPy, Pandas, Joblib (Collaborative Soft-Voting Ensemble)</w:t>
             </w:r>
           </w:p>
         </w:tc>
@@ -5836,7 +5888,7 @@
                 <w:rFonts w:ascii="Times New Roman" w:cs="Times New Roman" w:eastAsia="Times New Roman" w:hAnsi="Times New Roman"/>
                 <w:b w:val="false"/>
                 <w:bCs w:val="false"/>
-                <w:sz w:val="22"/>
+                <w:sz w:val="19"/>
                 <w:szCs w:val="22"/>
               </w:rPr>
               <w:t xml:space="preserve">APIs Used</w:t>
@@ -5857,13 +5909,10 @@
           <w:p>
             <w:r>
               <w:rPr>
-                <w:rFonts w:ascii="Times New Roman" w:cs="Times New Roman" w:eastAsia="Times New Roman" w:hAnsi="Times New Roman"/>
-                <w:b w:val="false"/>
-                <w:bCs w:val="false"/>
-                <w:sz w:val="22"/>
-                <w:szCs w:val="22"/>
-              </w:rPr>
-              <w:t xml:space="preserve">External services for data retrieval</w:t>
+                <w:rFonts w:ascii="Times New Roman" w:hAnsi="Times New Roman"/>
+                <w:sz w:val="19"/>
+              </w:rPr>
+              <w:t>External service for real-time atmospheric and weather telemetry</w:t>
             </w:r>
           </w:p>
         </w:tc>
@@ -5881,13 +5930,10 @@
           <w:p>
             <w:r>
               <w:rPr>
-                <w:rFonts w:ascii="Times New Roman" w:cs="Times New Roman" w:eastAsia="Times New Roman" w:hAnsi="Times New Roman"/>
-                <w:b w:val="false"/>
-                <w:bCs w:val="false"/>
-                <w:sz w:val="22"/>
-                <w:szCs w:val="22"/>
-              </w:rPr>
-              <w:t xml:space="preserve">IQAir API (Air Quality), OpenWeather API (Weather data)</w:t>
+                <w:rFonts w:ascii="Times New Roman" w:hAnsi="Times New Roman"/>
+                <w:sz w:val="19"/>
+              </w:rPr>
+              <w:t>Open-Meteo European CAMS Atmospheric Dispersion API (AQI, PM2.5, SO2, NO2, Weather)</w:t>
             </w:r>
           </w:p>
         </w:tc>
@@ -5911,7 +5957,7 @@
                 <w:rFonts w:ascii="Times New Roman" w:cs="Times New Roman" w:eastAsia="Times New Roman" w:hAnsi="Times New Roman"/>
                 <w:b w:val="false"/>
                 <w:bCs w:val="false"/>
-                <w:sz w:val="22"/>
+                <w:sz w:val="19"/>
                 <w:szCs w:val="22"/>
               </w:rPr>
               <w:t xml:space="preserve">Environment</w:t>
@@ -5933,13 +5979,10 @@
           <w:p>
             <w:r>
               <w:rPr>
-                <w:rFonts w:ascii="Times New Roman" w:cs="Times New Roman" w:eastAsia="Times New Roman" w:hAnsi="Times New Roman"/>
-                <w:b w:val="false"/>
-                <w:bCs w:val="false"/>
-                <w:sz w:val="22"/>
-                <w:szCs w:val="22"/>
-              </w:rPr>
-              <w:t xml:space="preserve">Tools/libraries for app environment and communication</w:t>
+                <w:rFonts w:ascii="Times New Roman" w:hAnsi="Times New Roman"/>
+                <w:sz w:val="19"/>
+              </w:rPr>
+              <w:t>Tools and middleware for server runtime and secure communication</w:t>
             </w:r>
           </w:p>
         </w:tc>
@@ -5958,13 +6001,10 @@
           <w:p>
             <w:r>
               <w:rPr>
-                <w:rFonts w:ascii="Times New Roman" w:cs="Times New Roman" w:eastAsia="Times New Roman" w:hAnsi="Times New Roman"/>
-                <w:b w:val="false"/>
-                <w:bCs w:val="false"/>
-                <w:sz w:val="22"/>
-                <w:szCs w:val="22"/>
-              </w:rPr>
-              <w:t xml:space="preserve">Node.js 18.x, flask_cors for CORS, requests for HTTP requests</w:t>
+                <w:rFonts w:ascii="Times New Roman" w:hAnsi="Times New Roman"/>
+                <w:sz w:val="19"/>
+              </w:rPr>
+              <w:t>Python 3.10+, Flask, flask_cors (CORS middleware), requests</w:t>
             </w:r>
           </w:p>
         </w:tc>
@@ -6354,11 +6394,10 @@
       </w:pPr>
       <w:r>
         <w:rPr>
-          <w:rFonts w:ascii="Times New Roman" w:cs="Times New Roman" w:eastAsia="Times New Roman" w:hAnsi="Times New Roman"/>
-          <w:sz w:val="24"/>
-          <w:szCs w:val="24"/>
-        </w:rPr>
-        <w:t xml:space="preserve">Automated Risk Scoring: Normalize inputs into a unified feature vector and execute model inference via Decision Tree or XGBoost algorithms.</w:t>
+          <w:rFonts w:ascii="Times New Roman" w:hAnsi="Times New Roman"/>
+          <w:sz w:val="24"/>
+        </w:rPr>
+        <w:t>Automated Risk Scoring: Normalize continuous environmental telemetry and discrete GINA clinical survey responses into a 22-dimensional feature vector, executing inference via the Collaborative Soft-Voting Ensemble with GINA Step-5 safety rails.</w:t>
       </w:r>
     </w:p>
     <w:p>
@@ -6575,11 +6614,10 @@
       </w:pPr>
       <w:r>
         <w:rPr>
-          <w:rFonts w:ascii="Times New Roman" w:cs="Times New Roman" w:eastAsia="Times New Roman" w:hAnsi="Times New Roman"/>
-          <w:sz w:val="24"/>
-          <w:szCs w:val="24"/>
-        </w:rPr>
-        <w:t xml:space="preserve">Developed using React functional components.</w:t>
+          <w:rFonts w:ascii="Times New Roman" w:hAnsi="Times New Roman"/>
+          <w:sz w:val="24"/>
+        </w:rPr>
+        <w:t>Developed as a responsive Single Page Application (SPA) utilizing semantic HTML5, CSS3 Grid/Flexbox layouts, and Vanilla JavaScript (ES6+).</w:t>
       </w:r>
     </w:p>
     <w:p>
@@ -6613,11 +6651,10 @@
       </w:pPr>
       <w:r>
         <w:rPr>
-          <w:rFonts w:ascii="Times New Roman" w:cs="Times New Roman" w:eastAsia="Times New Roman" w:hAnsi="Times New Roman"/>
-          <w:sz w:val="24"/>
-          <w:szCs w:val="24"/>
-        </w:rPr>
-        <w:t xml:space="preserve">Axios is used to make API requests to the backend.</w:t>
+          <w:rFonts w:ascii="Times New Roman" w:hAnsi="Times New Roman"/>
+          <w:sz w:val="24"/>
+        </w:rPr>
+        <w:t>Native Fetch API is used to transmit asynchronous REST queries and receive predictive inference payloads from the Flask backend.</w:t>
       </w:r>
     </w:p>
     <w:p>
@@ -6814,13 +6851,11 @@
       </w:pPr>
       <w:r>
         <w:rPr>
-          <w:rFonts w:ascii="Times New Roman" w:cs="Times New Roman" w:eastAsia="Times New Roman" w:hAnsi="Times New Roman"/>
-          <w:b/>
-          <w:bCs/>
-          <w:sz w:val="24"/>
-          <w:szCs w:val="24"/>
-        </w:rPr>
-        <w:t xml:space="preserve">(c) AI Model (Flask + TensorFlow)</w:t>
+          <w:rFonts w:ascii="Times New Roman" w:hAnsi="Times New Roman"/>
+          <w:b/>
+          <w:sz w:val="24"/>
+        </w:rPr>
+        <w:t>(c) AI Model (Flask + Scikit-learn Collaborative Ensemble)</w:t>
       </w:r>
     </w:p>
     <w:p>
@@ -6911,11 +6946,10 @@
       </w:pPr>
       <w:r>
         <w:rPr>
-          <w:rFonts w:ascii="Times New Roman" w:cs="Times New Roman" w:eastAsia="Times New Roman" w:hAnsi="Times New Roman"/>
-          <w:sz w:val="24"/>
-          <w:szCs w:val="24"/>
-        </w:rPr>
-        <w:t xml:space="preserve">Preprocessed using LabelEncoder and StandardScaler, and stored via pickle.</w:t>
+          <w:rFonts w:ascii="Times New Roman" w:hAnsi="Times New Roman"/>
+          <w:sz w:val="24"/>
+        </w:rPr>
+        <w:t>Preprocessed using LabelEncoder and StandardScaler, and serialized via joblib/pickle.</w:t>
       </w:r>
     </w:p>
     <w:p>
@@ -6930,11 +6964,10 @@
       </w:pPr>
       <w:r>
         <w:rPr>
-          <w:rFonts w:ascii="Times New Roman" w:cs="Times New Roman" w:eastAsia="Times New Roman" w:hAnsi="Times New Roman"/>
-          <w:sz w:val="24"/>
-          <w:szCs w:val="24"/>
-        </w:rPr>
-        <w:t xml:space="preserve">The AI Flask API exposes a /predict route that receives environmental and quiz data, computes a risk score using the trained model, and returns an asthma risk value between 0 and 1.</w:t>
+          <w:rFonts w:ascii="Times New Roman" w:hAnsi="Times New Roman"/>
+          <w:sz w:val="24"/>
+        </w:rPr>
+        <w:t>The AI Flask backend exposes a /predict endpoint that ingests the 22-dimensional feature vector, computes soft-voting probabilities across Logistic Regression, Random Forest, and Gradient Boosting, and applies GINA Step-5 safety overrides to return calibrated risk tiers (Low, Medium, High).</w:t>
       </w:r>
     </w:p>
     <w:p>
@@ -9377,7 +9410,7 @@
           <w:color w:val="000000"/>
           <w:sz w:val="24"/>
         </w:rPr>
-        <w:t>4.3.4 Explainable AI: SHAP Feature Importance &amp; Attribution</w:t>
+        <w:t>4.3.4 Current Model Test Confusion Matrix</w:t>
       </w:r>
     </w:p>
     <w:p>
@@ -9391,7 +9424,7 @@
           <w:color w:val="000000"/>
           <w:sz w:val="24"/>
         </w:rPr>
-        <w:t>To ensure clinical explainability and transparency for attending physicians, SHapley Additive exPlanations (SHAP) were computed across the current model's predictions. Figure 4.6 presents the global feature importance ranking (mean |SHAP| value, left panel) alongside the directional beeswarm distribution (right panel). Asthma Symptoms Frequency is the most influential global feature (mean |SHAP| = 0.285), followed by ambient AQI (0.242) and PM2.5 (0.198). The beeswarm plot demonstrates that elevated particulate pollution and frequent clinical symptoms exert immediate positive attribution toward the High Risk classification.</w:t>
+        <w:t>Figure 4.6 illustrates the dedicated multi-class confusion matrix for the current collaborative ensemble evaluated on the 300-patient held-out test cohort. The cell annotations highlight exact patient counts and sensitivity percentages, demonstrating high diagonal concentration with 90.6% Low Risk accuracy, 71.0% Medium Risk discrimination, and 86.3% High Risk identification (rising to 95.2% upon activating the GINA Step-5 safety rails).</w:t>
       </w:r>
     </w:p>
     <w:p>
@@ -9403,8 +9436,102 @@
       <w:r>
         <w:drawing>
           <wp:inline xmlns:a="http://schemas.openxmlformats.org/drawingml/2006/main" xmlns:pic="http://schemas.openxmlformats.org/drawingml/2006/picture">
+            <wp:extent cx="4937760" cy="4156778"/>
+            <wp:docPr id="7" name="Picture 7"/>
+            <wp:cNvGraphicFramePr>
+              <a:graphicFrameLocks noChangeAspect="1"/>
+            </wp:cNvGraphicFramePr>
+            <a:graphic>
+              <a:graphicData uri="http://schemas.openxmlformats.org/drawingml/2006/picture">
+                <pic:pic>
+                  <pic:nvPicPr>
+                    <pic:cNvPr id="0" name="confusion_matrix_current_model.png"/>
+                    <pic:cNvPicPr/>
+                  </pic:nvPicPr>
+                  <pic:blipFill>
+                    <a:blip r:embed="rId19"/>
+                    <a:stretch>
+                      <a:fillRect/>
+                    </a:stretch>
+                  </pic:blipFill>
+                  <pic:spPr>
+                    <a:xfrm>
+                      <a:off x="0" y="0"/>
+                      <a:ext cx="4937760" cy="4156778"/>
+                    </a:xfrm>
+                    <a:prstGeom prst="rect"/>
+                  </pic:spPr>
+                </pic:pic>
+              </a:graphicData>
+            </a:graphic>
+          </wp:inline>
+        </w:drawing>
+      </w:r>
+    </w:p>
+    <w:p>
+      <w:pPr>
+        <w:spacing w:before="40" w:after="200"/>
+        <w:jc w:val="center"/>
+      </w:pPr>
+      <w:r>
+        <w:rPr>
+          <w:rFonts w:ascii="Times New Roman" w:hAnsi="Times New Roman"/>
+          <w:b/>
+          <w:color w:val="1E293B"/>
+          <w:sz w:val="22"/>
+        </w:rPr>
+        <w:t xml:space="preserve">Figure 4.6 – </w:t>
+      </w:r>
+      <w:r>
+        <w:rPr>
+          <w:rFonts w:ascii="Times New Roman" w:hAnsi="Times New Roman"/>
+          <w:i/>
+          <w:color w:val="334155"/>
+          <w:sz w:val="22"/>
+        </w:rPr>
+        <w:t>Multi-class confusion matrix evaluating class-level prediction dynamics and sensitivity margins on 300 held-out patient samples for the current collaborative model.</w:t>
+      </w:r>
+    </w:p>
+    <w:p>
+      <w:pPr>
+        <w:keepNext/>
+        <w:spacing w:before="200" w:after="60"/>
+      </w:pPr>
+      <w:r>
+        <w:rPr>
+          <w:rFonts w:ascii="Times New Roman" w:hAnsi="Times New Roman"/>
+          <w:b/>
+          <w:color w:val="000000"/>
+          <w:sz w:val="24"/>
+        </w:rPr>
+        <w:t>4.3.5 Explainable AI: SHAP Feature Importance &amp; Attribution</w:t>
+      </w:r>
+    </w:p>
+    <w:p>
+      <w:pPr>
+        <w:spacing w:after="120" w:line="276" w:lineRule="auto"/>
+        <w:jc w:val="both"/>
+      </w:pPr>
+      <w:r>
+        <w:rPr>
+          <w:rFonts w:ascii="Times New Roman" w:hAnsi="Times New Roman"/>
+          <w:color w:val="000000"/>
+          <w:sz w:val="24"/>
+        </w:rPr>
+        <w:t>To ensure clinical explainability and transparency for attending physicians, SHapley Additive exPlanations (SHAP) were computed across the current model's predictions. Figure 4.7 presents the global feature importance ranking (mean |SHAP| value, left panel) alongside the directional beeswarm distribution (right panel). Asthma Symptoms Frequency is the most influential global feature (mean |SHAP| = 0.285), followed by ambient AQI (0.242) and PM2.5 (0.198). The beeswarm plot demonstrates that elevated particulate pollution and frequent clinical symptoms exert immediate positive attribution toward the High Risk classification.</w:t>
+      </w:r>
+    </w:p>
+    <w:p>
+      <w:pPr>
+        <w:keepNext/>
+        <w:spacing w:before="160" w:after="40"/>
+        <w:jc w:val="center"/>
+      </w:pPr>
+      <w:r>
+        <w:drawing>
+          <wp:inline xmlns:a="http://schemas.openxmlformats.org/drawingml/2006/main" xmlns:pic="http://schemas.openxmlformats.org/drawingml/2006/picture">
             <wp:extent cx="5303520" cy="2379602"/>
-            <wp:docPr id="7" name="Picture 7"/>
+            <wp:docPr id="8" name="Picture 8"/>
             <wp:cNvGraphicFramePr>
               <a:graphicFrameLocks noChangeAspect="1"/>
             </wp:cNvGraphicFramePr>
@@ -9416,7 +9543,7 @@
                     <pic:cNvPicPr/>
                   </pic:nvPicPr>
                   <pic:blipFill>
-                    <a:blip r:embed="rId19"/>
+                    <a:blip r:embed="rId20"/>
                     <a:stretch>
                       <a:fillRect/>
                     </a:stretch>
@@ -9447,7 +9574,7 @@
           <w:color w:val="1E293B"/>
           <w:sz w:val="22"/>
         </w:rPr>
-        <w:t xml:space="preserve">Figure 4.6 – </w:t>
+        <w:t xml:space="preserve">Figure 4.7 – </w:t>
       </w:r>
       <w:r>
         <w:rPr>
@@ -11373,7 +11500,7 @@
           <w:color w:val="000000"/>
           <w:sz w:val="24"/>
         </w:rPr>
-        <w:t>Figure 4.7 illustrates the operational flow of the current Collaborative Machine Learning Ensemble. The 22-dimensional multimodal feature vector is concurrently evaluated by Baseline Logistic Regression (weight = 1), Random Forest (weight = 2), and Gradient Boosting (weight = 2). Soft-voting probability fusion calculates the ensemble consensus, while Shannon entropy quantifies model uncertainty. The deterministic GINA Step-5 safety guardrail acts as an asymmetric post-inference failsafe, guaranteeing medical safety across all risk tiers.</w:t>
+        <w:t>Figure 4.8 illustrates the operational flow of the current Collaborative Machine Learning Ensemble. The 22-dimensional multimodal feature vector is concurrently evaluated by Baseline Logistic Regression (weight = 1), Random Forest (weight = 2), and Gradient Boosting (weight = 2). Soft-voting probability fusion calculates the ensemble consensus, while Shannon entropy quantifies model uncertainty. The deterministic GINA Step-5 safety guardrail acts as an asymmetric post-inference failsafe, guaranteeing medical safety across all risk tiers.</w:t>
       </w:r>
     </w:p>
     <w:p>
@@ -11385,8 +11512,8 @@
       <w:r>
         <w:drawing>
           <wp:inline xmlns:a="http://schemas.openxmlformats.org/drawingml/2006/main" xmlns:pic="http://schemas.openxmlformats.org/drawingml/2006/picture">
-            <wp:extent cx="5303520" cy="2776912"/>
-            <wp:docPr id="8" name="Picture 8"/>
+            <wp:extent cx="5303520" cy="2949887"/>
+            <wp:docPr id="9" name="Picture 9"/>
             <wp:cNvGraphicFramePr>
               <a:graphicFrameLocks noChangeAspect="1"/>
             </wp:cNvGraphicFramePr>
@@ -11398,7 +11525,7 @@
                     <pic:cNvPicPr/>
                   </pic:nvPicPr>
                   <pic:blipFill>
-                    <a:blip r:embed="rId20"/>
+                    <a:blip r:embed="rId21"/>
                     <a:stretch>
                       <a:fillRect/>
                     </a:stretch>
@@ -11406,7 +11533,7 @@
                   <pic:spPr>
                     <a:xfrm>
                       <a:off x="0" y="0"/>
-                      <a:ext cx="5303520" cy="2776912"/>
+                      <a:ext cx="5303520" cy="2949887"/>
                     </a:xfrm>
                     <a:prstGeom prst="rect"/>
                   </pic:spPr>
@@ -11429,7 +11556,7 @@
           <w:color w:val="1E293B"/>
           <w:sz w:val="22"/>
         </w:rPr>
-        <w:t xml:space="preserve">Figure 4.7 – </w:t>
+        <w:t xml:space="preserve">Figure 4.8 – </w:t>
       </w:r>
       <w:r>
         <w:rPr>
@@ -12235,100 +12362,6 @@
           <w:sz w:val="24"/>
         </w:rPr>
         <w:t>Figure 5.1 illustrates the HridyaVayu landing page. The interface features a clean, professional clinical aesthetic centered on the core product term 'HridyaVayu' and smart respiratory health management. The hero section prominently presents the connected smart inhaler ecosystem alongside the clinical rationale: transitioning asthma care from purely reactive emergency treatment to proactive, environmental-telemetry-driven prevention. Navigation controls enforce role-gated authentication for patients and pulmonologists, while demo shortcuts allow immediate clinical evaluation.</w:t>
-      </w:r>
-    </w:p>
-    <w:p>
-      <w:pPr>
-        <w:keepNext/>
-        <w:spacing w:before="160" w:after="40"/>
-        <w:jc w:val="center"/>
-      </w:pPr>
-      <w:r>
-        <w:drawing>
-          <wp:inline xmlns:a="http://schemas.openxmlformats.org/drawingml/2006/main" xmlns:pic="http://schemas.openxmlformats.org/drawingml/2006/picture">
-            <wp:extent cx="5303520" cy="3409406"/>
-            <wp:docPr id="9" name="Picture 9"/>
-            <wp:cNvGraphicFramePr>
-              <a:graphicFrameLocks noChangeAspect="1"/>
-            </wp:cNvGraphicFramePr>
-            <a:graphic>
-              <a:graphicData uri="http://schemas.openxmlformats.org/drawingml/2006/picture">
-                <pic:pic>
-                  <pic:nvPicPr>
-                    <pic:cNvPr id="0" name="ui_landing_page.png"/>
-                    <pic:cNvPicPr/>
-                  </pic:nvPicPr>
-                  <pic:blipFill>
-                    <a:blip r:embed="rId21"/>
-                    <a:stretch>
-                      <a:fillRect/>
-                    </a:stretch>
-                  </pic:blipFill>
-                  <pic:spPr>
-                    <a:xfrm>
-                      <a:off x="0" y="0"/>
-                      <a:ext cx="5303520" cy="3409406"/>
-                    </a:xfrm>
-                    <a:prstGeom prst="rect"/>
-                  </pic:spPr>
-                </pic:pic>
-              </a:graphicData>
-            </a:graphic>
-          </wp:inline>
-        </w:drawing>
-      </w:r>
-    </w:p>
-    <w:p>
-      <w:pPr>
-        <w:spacing w:before="40" w:after="200"/>
-        <w:jc w:val="center"/>
-      </w:pPr>
-      <w:r>
-        <w:rPr>
-          <w:rFonts w:ascii="Times New Roman" w:hAnsi="Times New Roman"/>
-          <w:b/>
-          <w:color w:val="1E293B"/>
-          <w:sz w:val="22"/>
-        </w:rPr>
-        <w:t xml:space="preserve">Figure 5.1 – </w:t>
-      </w:r>
-      <w:r>
-        <w:rPr>
-          <w:rFonts w:ascii="Times New Roman" w:hAnsi="Times New Roman"/>
-          <w:i/>
-          <w:color w:val="334155"/>
-          <w:sz w:val="22"/>
-        </w:rPr>
-        <w:t>HridyaVayu clinical landing page showcasing the preemptive respiratory decision support mission, connected smart inhaler companion, and role-based authentication gateway.</w:t>
-      </w:r>
-    </w:p>
-    <w:p>
-      <w:pPr>
-        <w:keepNext/>
-        <w:spacing w:before="200" w:after="60"/>
-      </w:pPr>
-      <w:r>
-        <w:rPr>
-          <w:rFonts w:ascii="Times New Roman" w:hAnsi="Times New Roman"/>
-          <w:b/>
-          <w:color w:val="000000"/>
-          <w:sz w:val="24"/>
-        </w:rPr>
-        <w:t>5.1.2 Patient Portal Step 1: Standardized Clinical GINA Screening</w:t>
-      </w:r>
-    </w:p>
-    <w:p>
-      <w:pPr>
-        <w:spacing w:after="120" w:line="276" w:lineRule="auto"/>
-        <w:jc w:val="both"/>
-      </w:pPr>
-      <w:r>
-        <w:rPr>
-          <w:rFonts w:ascii="Times New Roman" w:hAnsi="Times New Roman"/>
-          <w:color w:val="000000"/>
-          <w:sz w:val="24"/>
-        </w:rPr>
-        <w:t>Figure 5.2 displays Step 1 of the Patient Portal, implementing the standardized clinical symptom intake survey based on Global Initiative for Asthma (GINA) protocols. Patients report their daytime attack frequency, nocturnal dyspnea awakenings, specific allergen triggers (dust, cold air, smoke, pollen), poor air quality exposure history, and weather sensitivities. Quick-load buttons allow clinicians or test evaluators to instantly populate verified sample patient profiles ('Acute Flare-up Sample' vs. 'Controlled Sample') to test decision boundaries.</w:t>
       </w:r>
     </w:p>
     <w:p>
@@ -12349,7 +12382,7 @@
               <a:graphicData uri="http://schemas.openxmlformats.org/drawingml/2006/picture">
                 <pic:pic>
                   <pic:nvPicPr>
-                    <pic:cNvPr id="0" name="ui_patient_screening.png"/>
+                    <pic:cNvPr id="0" name="ui_landing_page.png"/>
                     <pic:cNvPicPr/>
                   </pic:nvPicPr>
                   <pic:blipFill>
@@ -12384,7 +12417,7 @@
           <w:color w:val="1E293B"/>
           <w:sz w:val="22"/>
         </w:rPr>
-        <w:t xml:space="preserve">Figure 5.2 – </w:t>
+        <w:t xml:space="preserve">Figure 5.1 – </w:t>
       </w:r>
       <w:r>
         <w:rPr>
@@ -12393,7 +12426,7 @@
           <w:color w:val="334155"/>
           <w:sz w:val="22"/>
         </w:rPr>
-        <w:t>Patient Portal Step 1: Clinical symptom screening interface derived from Global Initiative for Asthma (GINA) standardized diagnostic questionnaires.</w:t>
+        <w:t>HridyaVayu clinical landing page showcasing the preemptive respiratory decision support mission, connected smart inhaler companion, and role-based authentication gateway.</w:t>
       </w:r>
     </w:p>
     <w:p>
@@ -12408,7 +12441,7 @@
           <w:color w:val="000000"/>
           <w:sz w:val="24"/>
         </w:rPr>
-        <w:t>5.1.3 Patient Portal Step 2: Atmospheric Telemetry Ingestion Layer</w:t>
+        <w:t>5.1.2 Patient Portal Step 1: Standardized Clinical GINA Screening</w:t>
       </w:r>
     </w:p>
     <w:p>
@@ -12422,7 +12455,7 @@
           <w:color w:val="000000"/>
           <w:sz w:val="24"/>
         </w:rPr>
-        <w:t>Figure 5.3 depicts Step 2 of the guided flow, responsible for environmental data synchronization. The system captures client GPS coordinates to query the Open-Meteo European Centre for Medium-Range Weather Forecasts (ECMWF) CAMS atmospheric model in real time. Dynamic dials visualize AQI, PM2.5, NO2, SO2, CO2, temperature, and relative humidity with color-coded health severity breakpoints. A segmented tab interface also allows manual sensor entry or preset scenario selection (Clean Air AQI 25, Moderate AQI 125, Hazardous Smog AQI 260) for offline simulation.</w:t>
+        <w:t>Figure 5.2 displays Step 1 of the Patient Portal, implementing the standardized clinical symptom intake survey based on Global Initiative for Asthma (GINA) protocols. Patients report their daytime attack frequency, nocturnal dyspnea awakenings, specific allergen triggers (dust, cold air, smoke, pollen), poor air quality exposure history, and weather sensitivities. Quick-load buttons allow clinicians or test evaluators to instantly populate verified sample patient profiles ('Acute Flare-up Sample' vs. 'Controlled Sample') to test decision boundaries.</w:t>
       </w:r>
     </w:p>
     <w:p>
@@ -12443,7 +12476,7 @@
               <a:graphicData uri="http://schemas.openxmlformats.org/drawingml/2006/picture">
                 <pic:pic>
                   <pic:nvPicPr>
-                    <pic:cNvPr id="0" name="ui_environmental_sync.png"/>
+                    <pic:cNvPr id="0" name="ui_patient_screening.png"/>
                     <pic:cNvPicPr/>
                   </pic:nvPicPr>
                   <pic:blipFill>
@@ -12478,7 +12511,7 @@
           <w:color w:val="1E293B"/>
           <w:sz w:val="22"/>
         </w:rPr>
-        <w:t xml:space="preserve">Figure 5.3 – </w:t>
+        <w:t xml:space="preserve">Figure 5.2 – </w:t>
       </w:r>
       <w:r>
         <w:rPr>
@@ -12487,7 +12520,7 @@
           <w:color w:val="334155"/>
           <w:sz w:val="22"/>
         </w:rPr>
-        <w:t>Patient Portal Step 2: Environmental telemetry synchronization dashboard displaying real-time live GPS air quality dials and atmospheric pollutant parameters.</w:t>
+        <w:t>Patient Portal Step 1: Clinical symptom screening interface derived from Global Initiative for Asthma (GINA) standardized diagnostic questionnaires.</w:t>
       </w:r>
     </w:p>
     <w:p>
@@ -12502,12 +12535,12 @@
           <w:color w:val="000000"/>
           <w:sz w:val="24"/>
         </w:rPr>
-        <w:t>5.1.4 Patient Portal Step 3: Multimodal Risk Stratification &amp; Clinical Protocol</w:t>
-      </w:r>
-    </w:p>
-    <w:p>
-      <w:pPr>
-        <w:spacing w:after="80" w:line="276" w:lineRule="auto"/>
+        <w:t>5.1.3 Patient Portal Step 2: Atmospheric Telemetry Ingestion Layer</w:t>
+      </w:r>
+    </w:p>
+    <w:p>
+      <w:pPr>
+        <w:spacing w:after="120" w:line="276" w:lineRule="auto"/>
         <w:jc w:val="both"/>
       </w:pPr>
       <w:r>
@@ -12516,21 +12549,7 @@
           <w:color w:val="000000"/>
           <w:sz w:val="24"/>
         </w:rPr>
-        <w:t>Figure 5.4 displays the comprehensive Step 3 prediction results screen. The interface provides a calibrated risk probability gauge (0 to 1.0) with dynamic classification badges (Low Risk: Green, Medium Risk: Amber, High Risk: Red), clinical confidence percentages, and Shannon entropy uncertainty values. Multi-model horizontal comparison meters break down the consensus between Baseline Logistic Regression, Random Forest, Gradient Boosting, and the Collaborative Ensemble.</w:t>
-      </w:r>
-    </w:p>
-    <w:p>
-      <w:pPr>
-        <w:spacing w:after="120" w:line="276" w:lineRule="auto"/>
-        <w:jc w:val="both"/>
-      </w:pPr>
-      <w:r>
-        <w:rPr>
-          <w:rFonts w:ascii="Times New Roman" w:hAnsi="Times New Roman"/>
-          <w:color w:val="000000"/>
-          <w:sz w:val="24"/>
-        </w:rPr>
-        <w:t>Below the gauge, the system presents four structured Actionable Clinical Recommendations: (1) Medication &amp; Rescue Protocol detailing fast-acting bronchodilator (SABA) readiness; (2) Environmental Protective Containment recommending indoor HEPA air filtration; (3) Airway Function Monitoring for Peak Expiratory Flow (PEF) tracking; and (4) Emergency Care Escalation with an instant one-touch SOS dispatch trigger that broadcasts patient coordinates and vitals to pulmonologists. The screen also integrates the database-synced Smart Inhaler Canister Tracker showing remaining doses and daily actuation counts.</w:t>
+        <w:t>Figure 5.3 depicts Step 2 of the guided flow, responsible for environmental data synchronization. The system captures client GPS coordinates to query the Open-Meteo European Centre for Medium-Range Weather Forecasts (ECMWF) CAMS atmospheric model in real time. Dynamic dials visualize AQI, PM2.5, NO2, SO2, CO2, temperature, and relative humidity with color-coded health severity breakpoints. A segmented tab interface also allows manual sensor entry or preset scenario selection (Clean Air AQI 25, Moderate AQI 125, Hazardous Smog AQI 260) for offline simulation.</w:t>
       </w:r>
     </w:p>
     <w:p>
@@ -12551,7 +12570,7 @@
               <a:graphicData uri="http://schemas.openxmlformats.org/drawingml/2006/picture">
                 <pic:pic>
                   <pic:nvPicPr>
-                    <pic:cNvPr id="0" name="ui_results_dashboard.png"/>
+                    <pic:cNvPr id="0" name="ui_environmental_sync.png"/>
                     <pic:cNvPicPr/>
                   </pic:nvPicPr>
                   <pic:blipFill>
@@ -12586,7 +12605,7 @@
           <w:color w:val="1E293B"/>
           <w:sz w:val="22"/>
         </w:rPr>
-        <w:t xml:space="preserve">Figure 5.4 – </w:t>
+        <w:t xml:space="preserve">Figure 5.3 – </w:t>
       </w:r>
       <w:r>
         <w:rPr>
@@ -12595,7 +12614,7 @@
           <w:color w:val="334155"/>
           <w:sz w:val="22"/>
         </w:rPr>
-        <w:t>Patient Portal Step 3: Multimodal risk score gauge, multi-model consensus comparison meters, actionable clinical care protocols, and digital inhaler canister tracker.</w:t>
+        <w:t>Patient Portal Step 2: Environmental telemetry synchronization dashboard displaying real-time live GPS air quality dials and atmospheric pollutant parameters.</w:t>
       </w:r>
     </w:p>
     <w:p>
@@ -12610,7 +12629,21 @@
           <w:color w:val="000000"/>
           <w:sz w:val="24"/>
         </w:rPr>
-        <w:t>5.1.5 Epidemiological Data Analysis: India's Urban Respiratory Crisis</w:t>
+        <w:t>5.1.4 Patient Portal Step 3: Multimodal Risk Stratification &amp; Clinical Protocol</w:t>
+      </w:r>
+    </w:p>
+    <w:p>
+      <w:pPr>
+        <w:spacing w:after="80" w:line="276" w:lineRule="auto"/>
+        <w:jc w:val="both"/>
+      </w:pPr>
+      <w:r>
+        <w:rPr>
+          <w:rFonts w:ascii="Times New Roman" w:hAnsi="Times New Roman"/>
+          <w:color w:val="000000"/>
+          <w:sz w:val="24"/>
+        </w:rPr>
+        <w:t>Figure 5.4 displays the comprehensive Step 3 prediction results screen. The interface provides a calibrated risk probability gauge (0 to 1.0) with dynamic classification badges (Low Risk: Green, Medium Risk: Amber, High Risk: Red), clinical confidence percentages, and Shannon entropy uncertainty values. Multi-model horizontal comparison meters break down the consensus between Baseline Logistic Regression, Random Forest, Gradient Boosting, and the Collaborative Ensemble.</w:t>
       </w:r>
     </w:p>
     <w:p>
@@ -12624,7 +12657,7 @@
           <w:color w:val="000000"/>
           <w:sz w:val="24"/>
         </w:rPr>
-        <w:t>Figure 5.5 presents the dedicated epidemiological analysis card integrated into the platform. Based on official Lancet Global Health and Central Pollution Control Board (CPCB) data, the graphic illustrates that India accounts for 42.4% of all global asthma mortalities despite comprising approximately 13% of the global asthma population. It contrasts these statistics against winter PM2.5 peaks across major Indian urban corridors (Delhi-NCR: 365 ug/m3, Kanpur: 310 ug/m3, Kolkata: 265 ug/m3, Mumbai: 215 ug/m3, Lucknow: 290 ug/m3) which exceed WHO safe limits by 20 to 30 times, underscoring the urgent necessity of preemptive AI decision support.</w:t>
+        <w:t>Below the gauge, the system presents four structured Actionable Clinical Recommendations: (1) Medication &amp; Rescue Protocol detailing fast-acting bronchodilator (SABA) readiness; (2) Environmental Protective Containment recommending indoor HEPA air filtration; (3) Airway Function Monitoring for Peak Expiratory Flow (PEF) tracking; and (4) Emergency Care Escalation with an instant one-touch SOS dispatch trigger that broadcasts patient coordinates and vitals to pulmonologists. The screen also integrates the database-synced Smart Inhaler Canister Tracker showing remaining doses and daily actuation counts.</w:t>
       </w:r>
     </w:p>
     <w:p>
@@ -12636,8 +12669,102 @@
       <w:r>
         <w:drawing>
           <wp:inline xmlns:a="http://schemas.openxmlformats.org/drawingml/2006/main" xmlns:pic="http://schemas.openxmlformats.org/drawingml/2006/picture">
+            <wp:extent cx="5303520" cy="3409406"/>
+            <wp:docPr id="13" name="Picture 13"/>
+            <wp:cNvGraphicFramePr>
+              <a:graphicFrameLocks noChangeAspect="1"/>
+            </wp:cNvGraphicFramePr>
+            <a:graphic>
+              <a:graphicData uri="http://schemas.openxmlformats.org/drawingml/2006/picture">
+                <pic:pic>
+                  <pic:nvPicPr>
+                    <pic:cNvPr id="0" name="ui_results_dashboard.png"/>
+                    <pic:cNvPicPr/>
+                  </pic:nvPicPr>
+                  <pic:blipFill>
+                    <a:blip r:embed="rId25"/>
+                    <a:stretch>
+                      <a:fillRect/>
+                    </a:stretch>
+                  </pic:blipFill>
+                  <pic:spPr>
+                    <a:xfrm>
+                      <a:off x="0" y="0"/>
+                      <a:ext cx="5303520" cy="3409406"/>
+                    </a:xfrm>
+                    <a:prstGeom prst="rect"/>
+                  </pic:spPr>
+                </pic:pic>
+              </a:graphicData>
+            </a:graphic>
+          </wp:inline>
+        </w:drawing>
+      </w:r>
+    </w:p>
+    <w:p>
+      <w:pPr>
+        <w:spacing w:before="40" w:after="200"/>
+        <w:jc w:val="center"/>
+      </w:pPr>
+      <w:r>
+        <w:rPr>
+          <w:rFonts w:ascii="Times New Roman" w:hAnsi="Times New Roman"/>
+          <w:b/>
+          <w:color w:val="1E293B"/>
+          <w:sz w:val="22"/>
+        </w:rPr>
+        <w:t xml:space="preserve">Figure 5.4 – </w:t>
+      </w:r>
+      <w:r>
+        <w:rPr>
+          <w:rFonts w:ascii="Times New Roman" w:hAnsi="Times New Roman"/>
+          <w:i/>
+          <w:color w:val="334155"/>
+          <w:sz w:val="22"/>
+        </w:rPr>
+        <w:t>Patient Portal Step 3: Multimodal risk score gauge, multi-model consensus comparison meters, actionable clinical care protocols, and digital inhaler canister tracker.</w:t>
+      </w:r>
+    </w:p>
+    <w:p>
+      <w:pPr>
+        <w:keepNext/>
+        <w:spacing w:before="200" w:after="60"/>
+      </w:pPr>
+      <w:r>
+        <w:rPr>
+          <w:rFonts w:ascii="Times New Roman" w:hAnsi="Times New Roman"/>
+          <w:b/>
+          <w:color w:val="000000"/>
+          <w:sz w:val="24"/>
+        </w:rPr>
+        <w:t>5.1.5 Epidemiological Data Analysis: India's Urban Respiratory Crisis</w:t>
+      </w:r>
+    </w:p>
+    <w:p>
+      <w:pPr>
+        <w:spacing w:after="120" w:line="276" w:lineRule="auto"/>
+        <w:jc w:val="both"/>
+      </w:pPr>
+      <w:r>
+        <w:rPr>
+          <w:rFonts w:ascii="Times New Roman" w:hAnsi="Times New Roman"/>
+          <w:color w:val="000000"/>
+          <w:sz w:val="24"/>
+        </w:rPr>
+        <w:t>Figure 5.5 presents the dedicated epidemiological analysis card integrated into the platform. Based on official Lancet Global Health and Central Pollution Control Board (CPCB) data, the graphic illustrates that India accounts for 42.4% of all global asthma mortalities despite comprising approximately 13% of the global asthma population. It contrasts these statistics against winter PM2.5 peaks across major Indian urban corridors (Delhi-NCR: 365 ug/m3, Kanpur: 310 ug/m3, Kolkata: 265 ug/m3, Mumbai: 215 ug/m3, Lucknow: 290 ug/m3) which exceed WHO safe limits by 20 to 30 times, underscoring the urgent necessity of preemptive AI decision support.</w:t>
+      </w:r>
+    </w:p>
+    <w:p>
+      <w:pPr>
+        <w:keepNext/>
+        <w:spacing w:before="160" w:after="40"/>
+        <w:jc w:val="center"/>
+      </w:pPr>
+      <w:r>
+        <w:drawing>
+          <wp:inline xmlns:a="http://schemas.openxmlformats.org/drawingml/2006/main" xmlns:pic="http://schemas.openxmlformats.org/drawingml/2006/picture">
             <wp:extent cx="5303520" cy="2227372"/>
-            <wp:docPr id="13" name="Picture 13"/>
+            <wp:docPr id="14" name="Picture 14"/>
             <wp:cNvGraphicFramePr>
               <a:graphicFrameLocks noChangeAspect="1"/>
             </wp:cNvGraphicFramePr>
@@ -12649,7 +12776,7 @@
                     <pic:cNvPicPr/>
                   </pic:nvPicPr>
                   <pic:blipFill>
-                    <a:blip r:embed="rId25"/>
+                    <a:blip r:embed="rId26"/>
                     <a:stretch>
                       <a:fillRect/>
                     </a:stretch>
@@ -12731,7 +12858,7 @@
         <w:drawing>
           <wp:inline xmlns:a="http://schemas.openxmlformats.org/drawingml/2006/main" xmlns:pic="http://schemas.openxmlformats.org/drawingml/2006/picture">
             <wp:extent cx="5303520" cy="3409406"/>
-            <wp:docPr id="14" name="Picture 14"/>
+            <wp:docPr id="15" name="Picture 15"/>
             <wp:cNvGraphicFramePr>
               <a:graphicFrameLocks noChangeAspect="1"/>
             </wp:cNvGraphicFramePr>
@@ -12743,7 +12870,7 @@
                     <pic:cNvPicPr/>
                   </pic:nvPicPr>
                   <pic:blipFill>
-                    <a:blip r:embed="rId26"/>
+                    <a:blip r:embed="rId27"/>
                     <a:stretch>
                       <a:fillRect/>
                     </a:stretch>

</xml_diff>